<commit_message>
Overzicht van meldingen over alle projecten met tabelweergave
- Lijst: keuze Dit project / Alle projecten, filter op projecten
- Sorteerbare tabel voor desktop/webapp, kaarten op mobiel
- Kerncijfers open, te laat, vandaag en urgent
- Meldingdetail en Mijn taken tonen namen en rechten van het juiste project
- Installatiehandleiding v1.1 bijgewerkt (paragraaf 9.3)

Co-Authored-By: Claude Opus 5.5 <noreply@anthropic.com>
Claude-Session: https://claude.ai/code/session_01AvErfW5G91AE3E8RC53sBK
</commit_message>
<xml_diff>
--- a/docs/Installatiehandleiding_ProjectMelder.docx
+++ b/docs/Installatiehandleiding_ProjectMelder.docx
@@ -54,7 +54,7 @@
         <w:t xml:space="preserve">Versie: </w:t>
       </w:r>
       <w:r>
-        <w:t xml:space="preserve">1.0 – bij app-versie 0.1.0</w:t>
+        <w:t xml:space="preserve">1.1 – bij app-versie 0.1.0 (overzicht alle projecten)</w:t>
       </w:r>
     </w:p>
     <w:p>
@@ -6449,21 +6449,21 @@
           <w:b w:val="false"/>
           <w:bCs w:val="false"/>
         </w:rPr>
-        <w:t xml:space="preserve">Kies bovenin het </w:t>
+        <w:t xml:space="preserve">Open het tabblad </w:t>
       </w:r>
       <w:r>
         <w:rPr>
           <w:b/>
           <w:bCs/>
         </w:rPr>
-        <w:t xml:space="preserve">project</w:t>
-      </w:r>
-      <w:r>
-        <w:rPr>
-          <w:b w:val="false"/>
-          <w:bCs w:val="false"/>
-        </w:rPr>
-        <w:t xml:space="preserve"> (tik op het projectvak om te wisselen).</w:t>
+        <w:t xml:space="preserve">Lijst</w:t>
+      </w:r>
+      <w:r>
+        <w:rPr>
+          <w:b w:val="false"/>
+          <w:bCs w:val="false"/>
+        </w:rPr>
+        <w:t xml:space="preserve"> (kop “Meldingen”).</w:t>
       </w:r>
     </w:p>
     <w:p>
@@ -6480,21 +6480,35 @@
           <w:b w:val="false"/>
           <w:bCs w:val="false"/>
         </w:rPr>
-        <w:t xml:space="preserve">Open het tabblad </w:t>
+        <w:t xml:space="preserve">Kies bovenin </w:t>
       </w:r>
       <w:r>
         <w:rPr>
           <w:b/>
           <w:bCs/>
         </w:rPr>
-        <w:t xml:space="preserve">Lijst</w:t>
-      </w:r>
-      <w:r>
-        <w:rPr>
-          <w:b w:val="false"/>
-          <w:bCs w:val="false"/>
-        </w:rPr>
-        <w:t xml:space="preserve">: alle meldingen van het project (acties, besluiten, constateringen, afwijkingen, gereedmeldingen, verkeersmaatregelen, vragen).</w:t>
+        <w:t xml:space="preserve">Alle projecten</w:t>
+      </w:r>
+      <w:r>
+        <w:rPr>
+          <w:b w:val="false"/>
+          <w:bCs w:val="false"/>
+        </w:rPr>
+        <w:t xml:space="preserve"> om de meldingen van al je projecten in één overzicht te zien, of </w:t>
+      </w:r>
+      <w:r>
+        <w:rPr>
+          <w:b/>
+          <w:bCs/>
+        </w:rPr>
+        <w:t xml:space="preserve">Dit project</w:t>
+      </w:r>
+      <w:r>
+        <w:rPr>
+          <w:b w:val="false"/>
+          <w:bCs w:val="false"/>
+        </w:rPr>
+        <w:t xml:space="preserve"> voor één project. Met de projectknoppen (bijv. P2611, P2502) beperk je het overzicht tot enkele projecten.</w:t>
       </w:r>
     </w:p>
     <w:p>
@@ -6511,105 +6525,21 @@
           <w:b w:val="false"/>
           <w:bCs w:val="false"/>
         </w:rPr>
-        <w:t xml:space="preserve">Gebruik de snelfilters: </w:t>
+        <w:t xml:space="preserve">Bovenaan staan de </w:t>
       </w:r>
       <w:r>
         <w:rPr>
           <w:b/>
           <w:bCs/>
         </w:rPr>
-        <w:t xml:space="preserve">Alles open</w:t>
-      </w:r>
-      <w:r>
-        <w:rPr>
-          <w:b w:val="false"/>
-          <w:bCs w:val="false"/>
-        </w:rPr>
-        <w:t xml:space="preserve">, </w:t>
-      </w:r>
-      <w:r>
-        <w:rPr>
-          <w:b/>
-          <w:bCs/>
-        </w:rPr>
-        <w:t xml:space="preserve">Mijn acties</w:t>
-      </w:r>
-      <w:r>
-        <w:rPr>
-          <w:b w:val="false"/>
-          <w:bCs w:val="false"/>
-        </w:rPr>
-        <w:t xml:space="preserve">, </w:t>
-      </w:r>
-      <w:r>
-        <w:rPr>
-          <w:b/>
-          <w:bCs/>
-        </w:rPr>
-        <w:t xml:space="preserve">Te laat</w:t>
-      </w:r>
-      <w:r>
-        <w:rPr>
-          <w:b w:val="false"/>
-          <w:bCs w:val="false"/>
-        </w:rPr>
-        <w:t xml:space="preserve">, </w:t>
-      </w:r>
-      <w:r>
-        <w:rPr>
-          <w:b/>
-          <w:bCs/>
-        </w:rPr>
-        <w:t xml:space="preserve">Besluitenlijst</w:t>
-      </w:r>
-      <w:r>
-        <w:rPr>
-          <w:b w:val="false"/>
-          <w:bCs w:val="false"/>
-        </w:rPr>
-        <w:t xml:space="preserve">, </w:t>
-      </w:r>
-      <w:r>
-        <w:rPr>
-          <w:b/>
-          <w:bCs/>
-        </w:rPr>
-        <w:t xml:space="preserve">Actielijst</w:t>
-      </w:r>
-      <w:r>
-        <w:rPr>
-          <w:b w:val="false"/>
-          <w:bCs w:val="false"/>
-        </w:rPr>
-        <w:t xml:space="preserve">, </w:t>
-      </w:r>
-      <w:r>
-        <w:rPr>
-          <w:b/>
-          <w:bCs/>
-        </w:rPr>
-        <w:t xml:space="preserve">Afwijkingen</w:t>
-      </w:r>
-      <w:r>
-        <w:rPr>
-          <w:b w:val="false"/>
-          <w:bCs w:val="false"/>
-        </w:rPr>
-        <w:t xml:space="preserve">. Onder </w:t>
-      </w:r>
-      <w:r>
-        <w:rPr>
-          <w:b/>
-          <w:bCs/>
-        </w:rPr>
-        <w:t xml:space="preserve">Meer filters</w:t>
-      </w:r>
-      <w:r>
-        <w:rPr>
-          <w:b w:val="false"/>
-          <w:bCs w:val="false"/>
-        </w:rPr>
-        <w:t xml:space="preserve"> filter je op type en status (open, afgehandeld, alle).</w:t>
+        <w:t xml:space="preserve">kerncijfers</w:t>
+      </w:r>
+      <w:r>
+        <w:rPr>
+          <w:b w:val="false"/>
+          <w:bCs w:val="false"/>
+        </w:rPr>
+        <w:t xml:space="preserve">: open, te laat, vandaag af en ernst hoog/kritiek. Klik op “Te laat” om direct die meldingen te zien.</w:t>
       </w:r>
     </w:p>
     <w:p>
@@ -6626,21 +6556,21 @@
           <w:b w:val="false"/>
           <w:bCs w:val="false"/>
         </w:rPr>
-        <w:t xml:space="preserve">Zoek met het zoekveld op nummer, titel, locatie of in de </w:t>
+        <w:t xml:space="preserve">Kies </w:t>
       </w:r>
       <w:r>
         <w:rPr>
           <w:b/>
           <w:bCs/>
         </w:rPr>
-        <w:t xml:space="preserve">ingesproken tekst</w:t>
-      </w:r>
-      <w:r>
-        <w:rPr>
-          <w:b w:val="false"/>
-          <w:bCs w:val="false"/>
-        </w:rPr>
-        <w:t xml:space="preserve">.</w:t>
+        <w:t xml:space="preserve">Tabel</w:t>
+      </w:r>
+      <w:r>
+        <w:rPr>
+          <w:b w:val="false"/>
+          <w:bCs w:val="false"/>
+        </w:rPr>
+        <w:t xml:space="preserve"> voor een overzicht met kolommen (project, nummer, type, omschrijving, eigenaar, termijn, status, ernst, gemeld). Klik op een kolomkop om te sorteren; nogmaals klikken draait de volgorde om. Op een breed scherm staat de tabel standaard aan, op de telefoon de kaarten.</w:t>
       </w:r>
     </w:p>
     <w:p>
@@ -6657,7 +6587,105 @@
           <w:b w:val="false"/>
           <w:bCs w:val="false"/>
         </w:rPr>
-        <w:t xml:space="preserve">Klik op een melding voor alle details: foto’s en spraak met tijd en locatie, kaart, historie, discussie, en knoppen om status, eigenaar of termijn te wijzigen.</w:t>
+        <w:t xml:space="preserve">Gebruik de snelfilters: </w:t>
+      </w:r>
+      <w:r>
+        <w:rPr>
+          <w:b/>
+          <w:bCs/>
+        </w:rPr>
+        <w:t xml:space="preserve">Alles open</w:t>
+      </w:r>
+      <w:r>
+        <w:rPr>
+          <w:b w:val="false"/>
+          <w:bCs w:val="false"/>
+        </w:rPr>
+        <w:t xml:space="preserve">, </w:t>
+      </w:r>
+      <w:r>
+        <w:rPr>
+          <w:b/>
+          <w:bCs/>
+        </w:rPr>
+        <w:t xml:space="preserve">Mijn acties</w:t>
+      </w:r>
+      <w:r>
+        <w:rPr>
+          <w:b w:val="false"/>
+          <w:bCs w:val="false"/>
+        </w:rPr>
+        <w:t xml:space="preserve">, </w:t>
+      </w:r>
+      <w:r>
+        <w:rPr>
+          <w:b/>
+          <w:bCs/>
+        </w:rPr>
+        <w:t xml:space="preserve">Te laat</w:t>
+      </w:r>
+      <w:r>
+        <w:rPr>
+          <w:b w:val="false"/>
+          <w:bCs w:val="false"/>
+        </w:rPr>
+        <w:t xml:space="preserve">, </w:t>
+      </w:r>
+      <w:r>
+        <w:rPr>
+          <w:b/>
+          <w:bCs/>
+        </w:rPr>
+        <w:t xml:space="preserve">Besluitenlijst</w:t>
+      </w:r>
+      <w:r>
+        <w:rPr>
+          <w:b w:val="false"/>
+          <w:bCs w:val="false"/>
+        </w:rPr>
+        <w:t xml:space="preserve">, </w:t>
+      </w:r>
+      <w:r>
+        <w:rPr>
+          <w:b/>
+          <w:bCs/>
+        </w:rPr>
+        <w:t xml:space="preserve">Actielijst</w:t>
+      </w:r>
+      <w:r>
+        <w:rPr>
+          <w:b w:val="false"/>
+          <w:bCs w:val="false"/>
+        </w:rPr>
+        <w:t xml:space="preserve">, </w:t>
+      </w:r>
+      <w:r>
+        <w:rPr>
+          <w:b/>
+          <w:bCs/>
+        </w:rPr>
+        <w:t xml:space="preserve">Afwijkingen</w:t>
+      </w:r>
+      <w:r>
+        <w:rPr>
+          <w:b w:val="false"/>
+          <w:bCs w:val="false"/>
+        </w:rPr>
+        <w:t xml:space="preserve">. Onder </w:t>
+      </w:r>
+      <w:r>
+        <w:rPr>
+          <w:b/>
+          <w:bCs/>
+        </w:rPr>
+        <w:t xml:space="preserve">Meer filters</w:t>
+      </w:r>
+      <w:r>
+        <w:rPr>
+          <w:b w:val="false"/>
+          <w:bCs w:val="false"/>
+        </w:rPr>
+        <w:t xml:space="preserve"> filter je op type en status (open, afgehandeld, alle).</w:t>
       </w:r>
     </w:p>
     <w:p>
@@ -6674,6 +6702,54 @@
           <w:b w:val="false"/>
           <w:bCs w:val="false"/>
         </w:rPr>
+        <w:t xml:space="preserve">Zoek met het zoekveld op nummer, titel, locatie of in de </w:t>
+      </w:r>
+      <w:r>
+        <w:rPr>
+          <w:b/>
+          <w:bCs/>
+        </w:rPr>
+        <w:t xml:space="preserve">ingesproken tekst</w:t>
+      </w:r>
+      <w:r>
+        <w:rPr>
+          <w:b w:val="false"/>
+          <w:bCs w:val="false"/>
+        </w:rPr>
+        <w:t xml:space="preserve">.</w:t>
+      </w:r>
+    </w:p>
+    <w:p>
+      <w:pPr>
+        <w:pStyle w:val="ListParagraph"/>
+        <w:numPr>
+          <w:ilvl w:val="0"/>
+          <w:numId w:val="11"/>
+        </w:numPr>
+        <w:spacing w:after="80"/>
+      </w:pPr>
+      <w:r>
+        <w:rPr>
+          <w:b w:val="false"/>
+          <w:bCs w:val="false"/>
+        </w:rPr>
+        <w:t xml:space="preserve">Klik op een melding voor alle details: foto’s en spraak met tijd en locatie, kaart, historie, discussie, en knoppen om status, eigenaar of termijn te wijzigen.</w:t>
+      </w:r>
+    </w:p>
+    <w:p>
+      <w:pPr>
+        <w:pStyle w:val="ListParagraph"/>
+        <w:numPr>
+          <w:ilvl w:val="0"/>
+          <w:numId w:val="11"/>
+        </w:numPr>
+        <w:spacing w:after="80"/>
+      </w:pPr>
+      <w:r>
+        <w:rPr>
+          <w:b w:val="false"/>
+          <w:bCs w:val="false"/>
+        </w:rPr>
         <w:t xml:space="preserve">Exporteer de lijst naar </w:t>
       </w:r>
       <w:r>
@@ -6852,6 +6928,18 @@
     </w:p>
     <w:p>
       <w:pPr>
+        <w:spacing w:after="120"/>
+      </w:pPr>
+      <w:r>
+        <w:rPr>
+          <w:b w:val="false"/>
+          <w:bCs w:val="false"/>
+        </w:rPr>
+        <w:t xml:space="preserve">De keuzes voor Alle projecten, Tabel/Kaarten en de sortering worden per browser onthouden.</w:t>
+      </w:r>
+    </w:p>
+    <w:p>
+      <w:pPr>
         <w:pBdr>
           <w:left w:val="single" w:color="0B4F9C" w:sz="18" w:space="6"/>
         </w:pBdr>
@@ -6863,21 +6951,7 @@
           <w:b w:val="false"/>
           <w:bCs w:val="false"/>
         </w:rPr>
-        <w:t xml:space="preserve">Nog niet in deze versie (fase 2 van het FO): één lijst over </w:t>
-      </w:r>
-      <w:r>
-        <w:rPr>
-          <w:b/>
-          <w:bCs/>
-        </w:rPr>
-        <w:t xml:space="preserve">alle projecten</w:t>
-      </w:r>
-      <w:r>
-        <w:rPr>
-          <w:b w:val="false"/>
-          <w:bCs w:val="false"/>
-        </w:rPr>
-        <w:t xml:space="preserve"> tegelijk, een tabelweergave met kolommen, een dashboard met grafieken en pushmeldingen in de browser. Per project zie je wel alles.</w:t>
+        <w:t xml:space="preserve">Je ziet alleen projecten waarvan je deelnemer bent. Onderaannemers zien ook in het overzicht alleen meldingen van hun eigen organisatie of die aan hen zijn toegewezen. Nog niet in deze versie: een dashboard met grafieken en pushmeldingen in de browser.</w:t>
       </w:r>
     </w:p>
     <w:p>
@@ -10919,7 +10993,7 @@
         <w:sz w:val="16"/>
         <w:szCs w:val="16"/>
       </w:rPr>
-      <w:t xml:space="preserve">Installatiehandleiding ProjectMelder – v1.0</w:t>
+      <w:t xml:space="preserve">Installatiehandleiding ProjectMelder – v1.1</w:t>
     </w:r>
   </w:p>
 </w:hdr>

</xml_diff>